<commit_message>
dodat SSU promena_statusa_korisnika, i dodate žirijeve slike i prosečna ocena
Change-Id: Ic6431c795c274e5eeec5850f8396d7d4f1452491
</commit_message>
<xml_diff>
--- a/SSU/Prikaz_korisnickog_profila.docx
+++ b/SSU/Prikaz_korisnickog_profila.docx
@@ -3101,14 +3101,7 @@
           <w:i/>
           <w:lang w:val="sr-Latn-RS"/>
         </w:rPr>
-        <w:t xml:space="preserve"> </w:t>
-      </w:r>
-      <w:r>
-        <w:rPr>
-          <w:i/>
-          <w:lang w:val="sr-Latn-RS"/>
-        </w:rPr>
-        <w:t>pristupa profilu sa liste svih korisnika</w:t>
+        <w:t xml:space="preserve"> pristupa profilu sa liste svih korisnika</w:t>
       </w:r>
       <w:bookmarkEnd w:id="10"/>
       <w:r>
@@ -3303,7 +3296,14 @@
           <w:rFonts w:ascii="Times New Roman" w:eastAsia="Times New Roman" w:hAnsi="Times New Roman" w:cs="Times New Roman"/>
           <w:sz w:val="20"/>
         </w:rPr>
-        <w:t xml:space="preserve"> status i</w:t>
+        <w:t xml:space="preserve"> status</w:t>
+      </w:r>
+      <w:r>
+        <w:rPr>
+          <w:rFonts w:ascii="Times New Roman" w:eastAsia="Times New Roman" w:hAnsi="Times New Roman" w:cs="Times New Roman"/>
+          <w:sz w:val="20"/>
+        </w:rPr>
+        <w:t>,</w:t>
       </w:r>
       <w:r>
         <w:rPr>
@@ -3317,7 +3317,28 @@
           <w:rFonts w:ascii="Times New Roman" w:eastAsia="Times New Roman" w:hAnsi="Times New Roman" w:cs="Times New Roman"/>
           <w:sz w:val="20"/>
         </w:rPr>
-        <w:t>. Ukoliko je status “Umetnik”, prikazuje prosečnu ocenu, zarađenu sumu od fundiranja I objavljene slike. Ukoliko je status “Žiri”, prikazuje kvalifikaciju I kreirane izložbe.</w:t>
+        <w:t xml:space="preserve"> i objavljene slike</w:t>
+      </w:r>
+      <w:r>
+        <w:rPr>
+          <w:rFonts w:ascii="Times New Roman" w:eastAsia="Times New Roman" w:hAnsi="Times New Roman" w:cs="Times New Roman"/>
+          <w:sz w:val="20"/>
+        </w:rPr>
+        <w:t>. Ukoliko je status “Umetnik”, prikazuje prosečnu ocenu</w:t>
+      </w:r>
+      <w:r>
+        <w:rPr>
+          <w:rFonts w:ascii="Times New Roman" w:eastAsia="Times New Roman" w:hAnsi="Times New Roman" w:cs="Times New Roman"/>
+          <w:sz w:val="20"/>
+        </w:rPr>
+        <w:t xml:space="preserve"> i</w:t>
+      </w:r>
+      <w:r>
+        <w:rPr>
+          <w:rFonts w:ascii="Times New Roman" w:eastAsia="Times New Roman" w:hAnsi="Times New Roman" w:cs="Times New Roman"/>
+          <w:sz w:val="20"/>
+        </w:rPr>
+        <w:t xml:space="preserve"> zarađenu sumu od fundiranja. Ukoliko je status “Žiri”, prikazuje kvalifikaciju I kreirane izložbe.</w:t>
       </w:r>
     </w:p>
     <w:p>
@@ -7331,6 +7352,7 @@
   <w:style w:type="character" w:default="1" w:styleId="DefaultParagraphFont">
     <w:name w:val="Default Paragraph Font"/>
     <w:uiPriority w:val="1"/>
+    <w:semiHidden/>
     <w:unhideWhenUsed/>
   </w:style>
   <w:style w:type="table" w:default="1" w:styleId="TableNormal">

</xml_diff>